<commit_message>
fix: correct 28-31 July Agile Logbook
</commit_message>
<xml_diff>
--- a/assets/logbooks/231266731_Tiyani_Ngwana_Agile_Logbook_28-31_July_2026.docx
+++ b/assets/logbooks/231266731_Tiyani_Ngwana_Agile_Logbook_28-31_July_2026.docx
@@ -697,7 +697,7 @@
                 <w:rFonts w:eastAsia="Arial"/>
                 <w:sz w:val="18"/>
               </w:rPr>
-              <w:t>3</w:t>
+              <w:t>27</w:t>
             </w:r>
             <w:r>
               <w:rPr>
@@ -711,7 +711,7 @@
                 <w:rFonts w:eastAsia="Arial"/>
                 <w:sz w:val="18"/>
               </w:rPr>
-              <w:t>August</w:t>
+              <w:t>July</w:t>
             </w:r>
             <w:r>
               <w:rPr>
@@ -972,7 +972,7 @@
                 <w:rFonts w:eastAsia="Arial"/>
                 <w:sz w:val="18"/>
               </w:rPr>
-              <w:t>04</w:t>
+              <w:t>28</w:t>
             </w:r>
             <w:r>
               <w:rPr>
@@ -986,7 +986,7 @@
                 <w:rFonts w:eastAsia="Arial"/>
                 <w:sz w:val="18"/>
               </w:rPr>
-              <w:t>August</w:t>
+              <w:t>July</w:t>
             </w:r>
             <w:r>
               <w:rPr>
@@ -1261,7 +1261,7 @@
                 <w:rFonts w:eastAsia="Arial"/>
                 <w:sz w:val="18"/>
               </w:rPr>
-              <w:t>05</w:t>
+              <w:t>29</w:t>
             </w:r>
             <w:r>
               <w:rPr>
@@ -1275,7 +1275,7 @@
                 <w:rFonts w:eastAsia="Arial"/>
                 <w:sz w:val="18"/>
               </w:rPr>
-              <w:t>August</w:t>
+              <w:t>July</w:t>
             </w:r>
             <w:r>
               <w:rPr>
@@ -1545,7 +1545,7 @@
                 <w:rFonts w:eastAsia="Arial"/>
                 <w:sz w:val="18"/>
               </w:rPr>
-              <w:t>06</w:t>
+              <w:t>30</w:t>
             </w:r>
             <w:r>
               <w:rPr>
@@ -1559,7 +1559,7 @@
                 <w:rFonts w:eastAsia="Arial"/>
                 <w:sz w:val="18"/>
               </w:rPr>
-              <w:t>August</w:t>
+              <w:t>July</w:t>
             </w:r>
             <w:r>
               <w:rPr>
@@ -1841,7 +1841,7 @@
                 <w:sz w:val="18"/>
                 <w:szCs w:val="18"/>
               </w:rPr>
-              <w:t>07</w:t>
+              <w:t>31</w:t>
             </w:r>
             <w:r>
               <w:rPr>
@@ -1855,7 +1855,7 @@
                 <w:sz w:val="18"/>
                 <w:szCs w:val="18"/>
               </w:rPr>
-              <w:t>August</w:t>
+              <w:t>July</w:t>
             </w:r>
             <w:r>
               <w:rPr>
@@ -2133,19 +2133,19 @@
         <w:t xml:space="preserve">Between </w:t>
       </w:r>
       <w:r>
-        <w:t>3rd</w:t>
+        <w:t>28</w:t>
       </w:r>
       <w:r>
         <w:t xml:space="preserve"> and </w:t>
       </w:r>
       <w:r>
-        <w:t>7th</w:t>
+        <w:t>31</w:t>
       </w:r>
       <w:r>
         <w:t xml:space="preserve"> </w:t>
       </w:r>
       <w:r>
-        <w:t>August</w:t>
+        <w:t>July</w:t>
       </w:r>
       <w:r>
         <w:t>, the project progressed from a general grocery delivery idea into a more structured business concept. The team identified the primary users, clarified the problems being addressed and developed a proposed process for placing, combining, fulfilling and delivering orders.</w:t>
@@ -4647,6 +4647,26 @@
 </file>
 
 <file path=customXml/item1.xml><?xml version="1.0" encoding="utf-8"?>
+<p:properties xmlns:p="http://schemas.microsoft.com/office/2006/metadata/properties" xmlns:xsi="http://www.w3.org/2001/XMLSchema-instance" xmlns:pc="http://schemas.microsoft.com/office/infopath/2007/PartnerControls">
+  <documentManagement>
+    <lcf76f155ced4ddcb4097134ff3c332f xmlns="69d97f73-7a0f-46b3-9bd4-ee33f7f53429">
+      <Terms xmlns="http://schemas.microsoft.com/office/infopath/2007/PartnerControls"/>
+    </lcf76f155ced4ddcb4097134ff3c332f>
+    <TaxCatchAll xmlns="ad7b9bf4-a9c3-4aee-929f-9583f0677ab0" xsi:nil="true"/>
+  </documentManagement>
+</p:properties>
+</file>
+
+<file path=customXml/item2.xml><?xml version="1.0" encoding="utf-8"?>
+<?mso-contentType ?>
+<FormTemplates xmlns="http://schemas.microsoft.com/sharepoint/v3/contenttype/forms">
+  <Display>DocumentLibraryForm</Display>
+  <Edit>DocumentLibraryForm</Edit>
+  <New>DocumentLibraryForm</New>
+</FormTemplates>
+</file>
+
+<file path=customXml/item3.xml><?xml version="1.0" encoding="utf-8"?>
 <ct:contentTypeSchema xmlns:ct="http://schemas.microsoft.com/office/2006/metadata/contentType" xmlns:ma="http://schemas.microsoft.com/office/2006/metadata/properties/metaAttributes" ct:_="" ma:_="" ma:contentTypeName="Document" ma:contentTypeID="0x010100D70972A05E52C04EBE39B05D4BD5A9FB" ma:contentTypeVersion="10" ma:contentTypeDescription="Create a new document." ma:contentTypeScope="" ma:versionID="ffdc24c087dc23fd1252ab5c973cfe0d">
   <xsd:schema xmlns:xsd="http://www.w3.org/2001/XMLSchema" xmlns:xs="http://www.w3.org/2001/XMLSchema" xmlns:p="http://schemas.microsoft.com/office/2006/metadata/properties" xmlns:ns2="69d97f73-7a0f-46b3-9bd4-ee33f7f53429" xmlns:ns3="ad7b9bf4-a9c3-4aee-929f-9583f0677ab0" targetNamespace="http://schemas.microsoft.com/office/2006/metadata/properties" ma:root="true" ma:fieldsID="52ccefee38589e4ffa864db89c22dc63" ns2:_="" ns3:_="">
     <xsd:import namespace="69d97f73-7a0f-46b3-9bd4-ee33f7f53429"/>
@@ -4835,27 +4855,26 @@
 </ct:contentTypeSchema>
 </file>
 
-<file path=customXml/item2.xml><?xml version="1.0" encoding="utf-8"?>
-<?mso-contentType ?>
-<FormTemplates xmlns="http://schemas.microsoft.com/sharepoint/v3/contenttype/forms">
-  <Display>DocumentLibraryForm</Display>
-  <Edit>DocumentLibraryForm</Edit>
-  <New>DocumentLibraryForm</New>
-</FormTemplates>
+<file path=customXml/itemProps1.xml><?xml version="1.0" encoding="utf-8"?>
+<ds:datastoreItem xmlns:ds="http://schemas.openxmlformats.org/officeDocument/2006/customXml" ds:itemID="{09E0BC0A-75B9-4A70-9A64-D30C76AA9EF5}">
+  <ds:schemaRefs>
+    <ds:schemaRef ds:uri="http://schemas.microsoft.com/office/2006/metadata/properties"/>
+    <ds:schemaRef ds:uri="http://schemas.microsoft.com/office/infopath/2007/PartnerControls"/>
+    <ds:schemaRef ds:uri="69d97f73-7a0f-46b3-9bd4-ee33f7f53429"/>
+    <ds:schemaRef ds:uri="ad7b9bf4-a9c3-4aee-929f-9583f0677ab0"/>
+  </ds:schemaRefs>
+</ds:datastoreItem>
 </file>
 
-<file path=customXml/item3.xml><?xml version="1.0" encoding="utf-8"?>
-<p:properties xmlns:p="http://schemas.microsoft.com/office/2006/metadata/properties" xmlns:xsi="http://www.w3.org/2001/XMLSchema-instance" xmlns:pc="http://schemas.microsoft.com/office/infopath/2007/PartnerControls">
-  <documentManagement>
-    <lcf76f155ced4ddcb4097134ff3c332f xmlns="69d97f73-7a0f-46b3-9bd4-ee33f7f53429">
-      <Terms xmlns="http://schemas.microsoft.com/office/infopath/2007/PartnerControls"/>
-    </lcf76f155ced4ddcb4097134ff3c332f>
-    <TaxCatchAll xmlns="ad7b9bf4-a9c3-4aee-929f-9583f0677ab0" xsi:nil="true"/>
-  </documentManagement>
-</p:properties>
+<file path=customXml/itemProps2.xml><?xml version="1.0" encoding="utf-8"?>
+<ds:datastoreItem xmlns:ds="http://schemas.openxmlformats.org/officeDocument/2006/customXml" ds:itemID="{E7F28AA7-288A-413B-BA15-C14FBC6BDE26}">
+  <ds:schemaRefs>
+    <ds:schemaRef ds:uri="http://schemas.microsoft.com/sharepoint/v3/contenttype/forms"/>
+  </ds:schemaRefs>
+</ds:datastoreItem>
 </file>
 
-<file path=customXml/itemProps1.xml><?xml version="1.0" encoding="utf-8"?>
+<file path=customXml/itemProps3.xml><?xml version="1.0" encoding="utf-8"?>
 <ds:datastoreItem xmlns:ds="http://schemas.openxmlformats.org/officeDocument/2006/customXml" ds:itemID="{4611F281-9F4E-44CC-BDFC-13E5477DA15F}">
   <ds:schemaRefs>
     <ds:schemaRef ds:uri="http://schemas.microsoft.com/office/2006/metadata/contentType"/>
@@ -4872,23 +4891,4 @@
     <ds:schemaRef ds:uri="http://schemas.microsoft.com/internal/obd"/>
   </ds:schemaRefs>
 </ds:datastoreItem>
-</file>
-
-<file path=customXml/itemProps2.xml><?xml version="1.0" encoding="utf-8"?>
-<ds:datastoreItem xmlns:ds="http://schemas.openxmlformats.org/officeDocument/2006/customXml" ds:itemID="{E7F28AA7-288A-413B-BA15-C14FBC6BDE26}">
-  <ds:schemaRefs>
-    <ds:schemaRef ds:uri="http://schemas.microsoft.com/sharepoint/v3/contenttype/forms"/>
-  </ds:schemaRefs>
-</ds:datastoreItem>
-</file>
-
-<file path=customXml/itemProps3.xml><?xml version="1.0" encoding="utf-8"?>
-<ds:datastoreItem xmlns:ds="http://schemas.openxmlformats.org/officeDocument/2006/customXml" ds:itemID="{09E0BC0A-75B9-4A70-9A64-D30C76AA9EF5}">
-  <ds:schemaRefs>
-    <ds:schemaRef ds:uri="http://schemas.microsoft.com/office/2006/metadata/properties"/>
-    <ds:schemaRef ds:uri="http://schemas.microsoft.com/office/infopath/2007/PartnerControls"/>
-    <ds:schemaRef ds:uri="69d97f73-7a0f-46b3-9bd4-ee33f7f53429"/>
-    <ds:schemaRef ds:uri="ad7b9bf4-a9c3-4aee-929f-9583f0677ab0"/>
-  </ds:schemaRefs>
-</ds:datastoreItem>
 </file>
</xml_diff>